<commit_message>
Rebuild RAG IT Support Assistant as V2, additional features are added
</commit_message>
<xml_diff>
--- a/Readme.docx
+++ b/Readme.docx
@@ -5,17 +5,8 @@
     <w:p>
       <w:pPr>
         <w:pStyle w:val="Heading1"/>
-        <w:spacing w:before="0"/>
-        <w:jc w:val="center"/>
-        <w:rPr>
-          <w:b/>
-        </w:rPr>
-      </w:pPr>
-      <w:bookmarkStart w:id="0" w:name="it-support-knowledge-assistant"/>
-      <w:r>
-        <w:rPr>
-          <w:b/>
-        </w:rPr>
+      </w:pPr>
+      <w:r>
         <w:t>IT Support Knowledge Assistant</w:t>
       </w:r>
     </w:p>
@@ -29,7 +20,7 @@
         <w:pStyle w:val="FirstParagraph"/>
       </w:pPr>
       <w:r>
-        <w:t>A local Retrieval-Augmented Generation (RAG) application that helps users troubleshoot IT and networking issues using a custom knowledge base.</w:t>
+        <w:t>A local Retrieval-Augmented Generation (RAG) application that answers IT and network troubleshooting questions using ONLY the documents in the docs/ folder. The assistant combines semantic search, cross-encoder re-ranking, and a local LLM (Ollama) with strict guard rails so every answer is grounded in the knowledge base.</w:t>
       </w:r>
     </w:p>
     <w:p>
@@ -37,14 +28,13 @@
         <w:pStyle w:val="BodyText"/>
       </w:pPr>
       <w:r>
-        <w:t>The application combines semantic search with a local Large Language Model (LLM) to provide accurate answers based on technical documentation, troubleshooting guides, and support knowledge bases.</w:t>
+        <w:t>The model never answers from its own training knowledge: if the docs do not cover the question, the system refuses instead of guessing.</w:t>
       </w:r>
     </w:p>
     <w:p>
       <w:pPr>
         <w:pStyle w:val="Heading2"/>
       </w:pPr>
-      <w:bookmarkStart w:id="1" w:name="features"/>
       <w:r>
         <w:t>Features</w:t>
       </w:r>
@@ -52,51 +42,70 @@
     <w:p>
       <w:pPr>
         <w:pStyle w:val="Compact"/>
-        <w:numPr>
-          <w:ilvl w:val="0"/>
-          <w:numId w:val="2"/>
-        </w:numPr>
-      </w:pPr>
-      <w:r>
-        <w:t>Local LLM powered by Ollama and Llama 3.2</w:t>
+      </w:pPr>
+      <w:r>
+        <w:t>Answers only from docs/ - the knowledge base is the model's only source of truth</w:t>
       </w:r>
     </w:p>
     <w:p>
       <w:pPr>
         <w:pStyle w:val="Compact"/>
-        <w:numPr>
-          <w:ilvl w:val="0"/>
-          <w:numId w:val="2"/>
-        </w:numPr>
-      </w:pPr>
-      <w:r>
-        <w:t xml:space="preserve">ChromaDB </w:t>
-      </w:r>
-      <w:r>
-        <w:t>vector database for semantic search</w:t>
-      </w:r>
-      <w:bookmarkStart w:id="2" w:name="_GoBack"/>
-      <w:bookmarkEnd w:id="2"/>
+      </w:pPr>
+      <w:r>
+        <w:t>8-stage pipeline with live LED status indicators in the UI</w:t>
+      </w:r>
     </w:p>
     <w:p>
       <w:pPr>
         <w:pStyle w:val="Compact"/>
-        <w:numPr>
-          <w:ilvl w:val="0"/>
-          <w:numId w:val="2"/>
-        </w:numPr>
-      </w:pPr>
-      <w:r>
-        <w:t>Retrieval-Augmented Generation (RAG)</w:t>
+      </w:pPr>
+      <w:r>
+        <w:t>Cross-encoder re-ranking (ms-marco-MiniLM-L-6-v2) for retrieval quality</w:t>
       </w:r>
     </w:p>
     <w:p>
       <w:pPr>
         <w:pStyle w:val="Compact"/>
-        <w:numPr>
-          <w:ilvl w:val="0"/>
-          <w:numId w:val="2"/>
-        </w:numPr>
+      </w:pPr>
+      <w:r>
+        <w:t>Grounding check - every answer unit is verified against the docs</w:t>
+      </w:r>
+    </w:p>
+    <w:p>
+      <w:pPr>
+        <w:pStyle w:val="Compact"/>
+      </w:pPr>
+      <w:r>
+        <w:t>Confidence score (0-100) with HIGH / MEDIUM / LOW labels</w:t>
+      </w:r>
+    </w:p>
+    <w:p>
+      <w:pPr>
+        <w:pStyle w:val="Compact"/>
+      </w:pPr>
+      <w:r>
+        <w:t>Guard rails: prompt-injection blocking, network-domain gate, retrieval gate</w:t>
+      </w:r>
+    </w:p>
+    <w:p>
+      <w:pPr>
+        <w:pStyle w:val="Compact"/>
+      </w:pPr>
+      <w:r>
+        <w:t>ChromaDB vector database (47 chunks from 10 documents)</w:t>
+      </w:r>
+    </w:p>
+    <w:p>
+      <w:pPr>
+        <w:pStyle w:val="Compact"/>
+      </w:pPr>
+      <w:r>
+        <w:t>Local LLM via Ollama (qwen2.5:3b) - offline, no external API costs</w:t>
+      </w:r>
+    </w:p>
+    <w:p>
+      <w:pPr>
+        <w:pStyle w:val="Compact"/>
       </w:pPr>
       <w:r>
         <w:t>Streamlit web interface</w:t>
@@ -104,535 +113,773 @@
     </w:p>
     <w:p>
       <w:pPr>
+        <w:pStyle w:val="Heading2"/>
+      </w:pPr>
+      <w:r>
+        <w:t>Use Cases</w:t>
+      </w:r>
+    </w:p>
+    <w:p>
+      <w:pPr>
         <w:pStyle w:val="Compact"/>
-        <w:numPr>
-          <w:ilvl w:val="0"/>
-          <w:numId w:val="2"/>
-        </w:numPr>
-      </w:pPr>
-      <w:r>
-        <w:t>Offline operation after setup</w:t>
+      </w:pPr>
+      <w:r>
+        <w:t>Network troubleshooting</w:t>
       </w:r>
     </w:p>
     <w:p>
       <w:pPr>
         <w:pStyle w:val="Compact"/>
-        <w:numPr>
-          <w:ilvl w:val="0"/>
-          <w:numId w:val="2"/>
-        </w:numPr>
-      </w:pPr>
-      <w:r>
-        <w:t>Fast document retrieval</w:t>
+      </w:pPr>
+      <w:r>
+        <w:t>DNS issues</w:t>
       </w:r>
     </w:p>
     <w:p>
       <w:pPr>
         <w:pStyle w:val="Compact"/>
-        <w:numPr>
-          <w:ilvl w:val="0"/>
-          <w:numId w:val="2"/>
-        </w:numPr>
-      </w:pPr>
-      <w:r>
-        <w:t>Custom knowledge base support</w:t>
+      </w:pPr>
+      <w:r>
+        <w:t>DHCP / IP address problems</w:t>
       </w:r>
     </w:p>
     <w:p>
       <w:pPr>
         <w:pStyle w:val="Compact"/>
-        <w:numPr>
-          <w:ilvl w:val="0"/>
-          <w:numId w:val="2"/>
-        </w:numPr>
-      </w:pPr>
-      <w:r>
-        <w:t>No external API costs</w:t>
+      </w:pPr>
+      <w:r>
+        <w:t>Wi-Fi connectivity</w:t>
       </w:r>
     </w:p>
     <w:p>
       <w:pPr>
         <w:pStyle w:val="Compact"/>
-        <w:ind w:left="360"/>
-      </w:pPr>
+      </w:pPr>
+      <w:r>
+        <w:t>VPN / remote access</w:t>
+      </w:r>
+    </w:p>
+    <w:p>
+      <w:pPr>
+        <w:pStyle w:val="Compact"/>
+      </w:pPr>
+      <w:r>
+        <w:t>Firewall and port checks</w:t>
+      </w:r>
+    </w:p>
+    <w:p>
+      <w:pPr>
+        <w:pStyle w:val="Compact"/>
+      </w:pPr>
+      <w:r>
+        <w:t>Routing and switching (VLANs)</w:t>
+      </w:r>
+    </w:p>
+    <w:p>
+      <w:pPr>
+        <w:pStyle w:val="Compact"/>
+      </w:pPr>
+      <w:r>
+        <w:t>Packet loss and network performance</w:t>
+      </w:r>
+    </w:p>
+    <w:p>
+      <w:pPr>
+        <w:pStyle w:val="Compact"/>
+      </w:pPr>
+      <w:r>
+        <w:t>Incident response for network support</w:t>
+      </w:r>
     </w:p>
     <w:p>
       <w:pPr>
         <w:pStyle w:val="Heading2"/>
       </w:pPr>
-      <w:bookmarkStart w:id="3" w:name="use-cases"/>
-      <w:bookmarkEnd w:id="1"/>
-      <w:r>
-        <w:t>Use Cases</w:t>
+      <w:r>
+        <w:t>Technology Stack</w:t>
       </w:r>
     </w:p>
     <w:p>
       <w:pPr>
         <w:pStyle w:val="Compact"/>
-        <w:numPr>
-          <w:ilvl w:val="0"/>
-          <w:numId w:val="3"/>
-        </w:numPr>
-      </w:pPr>
-      <w:r>
-        <w:t>Network troubleshooting</w:t>
+      </w:pPr>
+      <w:r>
+        <w:t>Python 3.12</w:t>
       </w:r>
     </w:p>
     <w:p>
       <w:pPr>
         <w:pStyle w:val="Compact"/>
-        <w:numPr>
-          <w:ilvl w:val="0"/>
-          <w:numId w:val="3"/>
-        </w:numPr>
-      </w:pPr>
-      <w:r>
-        <w:t>DNS issues</w:t>
+      </w:pPr>
+      <w:r>
+        <w:t>Streamlit</w:t>
       </w:r>
     </w:p>
     <w:p>
       <w:pPr>
         <w:pStyle w:val="Compact"/>
-        <w:numPr>
-          <w:ilvl w:val="0"/>
-          <w:numId w:val="3"/>
-        </w:numPr>
-      </w:pPr>
-      <w:r>
-        <w:t>Wi-Fi co</w:t>
-      </w:r>
-      <w:r>
-        <w:t>nnectivity problems</w:t>
+      </w:pPr>
+      <w:r>
+        <w:t>LangChain (community + text splitters)</w:t>
       </w:r>
     </w:p>
     <w:p>
       <w:pPr>
         <w:pStyle w:val="Compact"/>
-        <w:numPr>
-          <w:ilvl w:val="0"/>
-          <w:numId w:val="3"/>
-        </w:numPr>
-      </w:pPr>
-      <w:r>
-        <w:t>VPN troubleshooting</w:t>
+      </w:pPr>
+      <w:r>
+        <w:t>ChromaDB</w:t>
       </w:r>
     </w:p>
     <w:p>
       <w:pPr>
         <w:pStyle w:val="Compact"/>
-        <w:numPr>
-          <w:ilvl w:val="0"/>
-          <w:numId w:val="3"/>
-        </w:numPr>
-      </w:pPr>
-      <w:r>
-        <w:t>Windows administration</w:t>
+      </w:pPr>
+      <w:r>
+        <w:t>Ollama (qwen2.5:3b)</w:t>
       </w:r>
     </w:p>
     <w:p>
       <w:pPr>
         <w:pStyle w:val="Compact"/>
-        <w:numPr>
-          <w:ilvl w:val="0"/>
-          <w:numId w:val="3"/>
-        </w:numPr>
-      </w:pPr>
-      <w:r>
-        <w:t>Active Directory basics</w:t>
+      </w:pPr>
+      <w:r>
+        <w:t>Sentence Transformers (all-MiniLM-L6-v2 embeddings + ms-marco cross-encoder reranker)</w:t>
+      </w:r>
+    </w:p>
+    <w:p>
+      <w:pPr>
+        <w:pStyle w:val="Heading2"/>
+      </w:pPr>
+      <w:r>
+        <w:t>Project Structure</w:t>
+      </w:r>
+    </w:p>
+    <w:p>
+      <w:pPr>
+        <w:pStyle w:val="SourceCode"/>
+      </w:pPr>
+      <w:r>
+        <w:t>RAG_IT_Support_System_1/</w:t>
+      </w:r>
+    </w:p>
+    <w:p>
+      <w:pPr>
+        <w:pStyle w:val="SourceCode"/>
+      </w:pPr>
+      <w:r>
+        <w:t>│</w:t>
+      </w:r>
+    </w:p>
+    <w:p>
+      <w:pPr>
+        <w:pStyle w:val="SourceCode"/>
+      </w:pPr>
+      <w:r>
+        <w:t>├── app.py            # Streamlit UI (LED pipeline, confidence, sources)</w:t>
+      </w:r>
+    </w:p>
+    <w:p>
+      <w:pPr>
+        <w:pStyle w:val="SourceCode"/>
+      </w:pPr>
+      <w:r>
+        <w:t>├── ingest.py         # Builds/rebuilds chroma_db from docs/</w:t>
+      </w:r>
+    </w:p>
+    <w:p>
+      <w:pPr>
+        <w:pStyle w:val="SourceCode"/>
+      </w:pPr>
+      <w:r>
+        <w:t>├── rag_engine.py     # 8-stage pipeline + guard rails</w:t>
+      </w:r>
+    </w:p>
+    <w:p>
+      <w:pPr>
+        <w:pStyle w:val="SourceCode"/>
+      </w:pPr>
+      <w:r>
+        <w:t>├── requirements.txt</w:t>
+      </w:r>
+    </w:p>
+    <w:p>
+      <w:pPr>
+        <w:pStyle w:val="SourceCode"/>
+      </w:pPr>
+      <w:r>
+        <w:t>├── Readme.docx</w:t>
+      </w:r>
+    </w:p>
+    <w:p>
+      <w:pPr>
+        <w:pStyle w:val="SourceCode"/>
+      </w:pPr>
+      <w:r>
+        <w:t>├── .gitignore</w:t>
+      </w:r>
+    </w:p>
+    <w:p>
+      <w:pPr>
+        <w:pStyle w:val="SourceCode"/>
+      </w:pPr>
+      <w:r>
+        <w:t>│</w:t>
+      </w:r>
+    </w:p>
+    <w:p>
+      <w:pPr>
+        <w:pStyle w:val="SourceCode"/>
+      </w:pPr>
+      <w:r>
+        <w:t>├── docs/             # Knowledge base (10 .txt files - the ONLY data source)</w:t>
+      </w:r>
+    </w:p>
+    <w:p>
+      <w:pPr>
+        <w:pStyle w:val="SourceCode"/>
+      </w:pPr>
+      <w:r>
+        <w:t>│   ├── 01_network_troubleshooting_fundamentals.txt</w:t>
+      </w:r>
+    </w:p>
+    <w:p>
+      <w:pPr>
+        <w:pStyle w:val="SourceCode"/>
+      </w:pPr>
+      <w:r>
+        <w:t>│   ├── 02_dns_troubleshooting.txt</w:t>
+      </w:r>
+    </w:p>
+    <w:p>
+      <w:pPr>
+        <w:pStyle w:val="SourceCode"/>
+      </w:pPr>
+      <w:r>
+        <w:t>│   ├── 03_dhcp_troubleshooting.txt</w:t>
+      </w:r>
+    </w:p>
+    <w:p>
+      <w:pPr>
+        <w:pStyle w:val="SourceCode"/>
+      </w:pPr>
+      <w:r>
+        <w:t>│   ├── 04_tcp_ip_connectivity.txt</w:t>
+      </w:r>
+    </w:p>
+    <w:p>
+      <w:pPr>
+        <w:pStyle w:val="SourceCode"/>
+      </w:pPr>
+      <w:r>
+        <w:t>│   ├── 05_wifi_troubleshooting.txt</w:t>
+      </w:r>
+    </w:p>
+    <w:p>
+      <w:pPr>
+        <w:pStyle w:val="SourceCode"/>
+      </w:pPr>
+      <w:r>
+        <w:t>│   ├── 06_vpn_remote_access.txt</w:t>
+      </w:r>
+    </w:p>
+    <w:p>
+      <w:pPr>
+        <w:pStyle w:val="SourceCode"/>
+      </w:pPr>
+      <w:r>
+        <w:t>│   ├── 07_firewall_ports.txt</w:t>
+      </w:r>
+    </w:p>
+    <w:p>
+      <w:pPr>
+        <w:pStyle w:val="SourceCode"/>
+      </w:pPr>
+      <w:r>
+        <w:t>│   ├── 08_routing_switching.txt</w:t>
+      </w:r>
+    </w:p>
+    <w:p>
+      <w:pPr>
+        <w:pStyle w:val="SourceCode"/>
+      </w:pPr>
+      <w:r>
+        <w:t>│   ├── 09_network_performance_packet_loss.txt</w:t>
+      </w:r>
+    </w:p>
+    <w:p>
+      <w:pPr>
+        <w:pStyle w:val="SourceCode"/>
+      </w:pPr>
+      <w:r>
+        <w:t>│   └── 10_incident_response_network_support.txt</w:t>
+      </w:r>
+    </w:p>
+    <w:p>
+      <w:pPr>
+        <w:pStyle w:val="SourceCode"/>
+      </w:pPr>
+      <w:r>
+        <w:t>│</w:t>
+      </w:r>
+    </w:p>
+    <w:p>
+      <w:pPr>
+        <w:pStyle w:val="SourceCode"/>
+      </w:pPr>
+      <w:r>
+        <w:t>├── chroma_db/        # Vector database (generated by ingest.py)</w:t>
+      </w:r>
+    </w:p>
+    <w:p>
+      <w:pPr>
+        <w:pStyle w:val="SourceCode"/>
+      </w:pPr>
+      <w:r>
+        <w:t>└── rag_errors.log    # Runtime warnings/errors</w:t>
+      </w:r>
+    </w:p>
+    <w:p>
+      <w:pPr>
+        <w:pStyle w:val="Heading2"/>
+      </w:pPr>
+      <w:r>
+        <w:t>Installation</w:t>
+      </w:r>
+    </w:p>
+    <w:p>
+      <w:pPr>
+        <w:pStyle w:val="Heading3"/>
+      </w:pPr>
+      <w:r>
+        <w:t>Create Virtual Environment</w:t>
+      </w:r>
+    </w:p>
+    <w:p>
+      <w:pPr>
+        <w:pStyle w:val="SourceCode"/>
+      </w:pPr>
+      <w:r>
+        <w:t>python -m venv .venv</w:t>
+      </w:r>
+    </w:p>
+    <w:p>
+      <w:pPr>
+        <w:pStyle w:val="SourceCode"/>
+      </w:pPr>
+    </w:p>
+    <w:p>
+      <w:pPr>
+        <w:pStyle w:val="Heading3"/>
+      </w:pPr>
+      <w:r>
+        <w:t>Activate Virtual Environment</w:t>
+      </w:r>
+    </w:p>
+    <w:p>
+      <w:pPr>
+        <w:pStyle w:val="FirstParagraph"/>
+      </w:pPr>
+      <w:r>
+        <w:t>Windows:</w:t>
+      </w:r>
+    </w:p>
+    <w:p>
+      <w:pPr>
+        <w:pStyle w:val="SourceCode"/>
+      </w:pPr>
+      <w:r>
+        <w:t>.venv\Scripts\activate</w:t>
+      </w:r>
+    </w:p>
+    <w:p>
+      <w:pPr>
+        <w:pStyle w:val="SourceCode"/>
+      </w:pPr>
+    </w:p>
+    <w:p>
+      <w:pPr>
+        <w:pStyle w:val="Heading3"/>
+      </w:pPr>
+      <w:r>
+        <w:t>Install Dependencies</w:t>
+      </w:r>
+    </w:p>
+    <w:p>
+      <w:pPr>
+        <w:pStyle w:val="SourceCode"/>
+      </w:pPr>
+      <w:r>
+        <w:t>pip install -r requirements.txt</w:t>
+      </w:r>
+    </w:p>
+    <w:p>
+      <w:pPr>
+        <w:pStyle w:val="SourceCode"/>
+      </w:pPr>
+    </w:p>
+    <w:p>
+      <w:pPr>
+        <w:pStyle w:val="Heading3"/>
+      </w:pPr>
+      <w:r>
+        <w:t>Install Ollama Model</w:t>
+      </w:r>
+    </w:p>
+    <w:p>
+      <w:pPr>
+        <w:pStyle w:val="SourceCode"/>
+      </w:pPr>
+      <w:r>
+        <w:t>ollama pull qwen2.5:3b</w:t>
+      </w:r>
+    </w:p>
+    <w:p>
+      <w:pPr>
+        <w:pStyle w:val="SourceCode"/>
+      </w:pPr>
+    </w:p>
+    <w:p>
+      <w:pPr>
+        <w:pStyle w:val="FirstParagraph"/>
+      </w:pPr>
+      <w:r>
+        <w:t>Ollama must be running (start the Ollama app or run `ollama serve`). The engine connects to http://127.0.0.1:11434.</w:t>
+      </w:r>
+    </w:p>
+    <w:p>
+      <w:pPr>
+        <w:pStyle w:val="SourceCode"/>
+      </w:pPr>
+    </w:p>
+    <w:p>
+      <w:pPr>
+        <w:pStyle w:val="Heading3"/>
+      </w:pPr>
+      <w:r>
+        <w:t>Build Vector Database</w:t>
+      </w:r>
+    </w:p>
+    <w:p>
+      <w:pPr>
+        <w:pStyle w:val="SourceCode"/>
+      </w:pPr>
+      <w:r>
+        <w:t>python ingest.py</w:t>
+      </w:r>
+    </w:p>
+    <w:p>
+      <w:pPr>
+        <w:pStyle w:val="SourceCode"/>
+      </w:pPr>
+    </w:p>
+    <w:p>
+      <w:pPr>
+        <w:pStyle w:val="Heading3"/>
+      </w:pPr>
+      <w:r>
+        <w:t>Launch Application</w:t>
+      </w:r>
+    </w:p>
+    <w:p>
+      <w:pPr>
+        <w:pStyle w:val="SourceCode"/>
+      </w:pPr>
+      <w:r>
+        <w:t>streamlit run app.py</w:t>
+      </w:r>
+    </w:p>
+    <w:p>
+      <w:pPr>
+        <w:pStyle w:val="SourceCode"/>
+      </w:pPr>
+    </w:p>
+    <w:p>
+      <w:pPr>
+        <w:pStyle w:val="Heading2"/>
+      </w:pPr>
+      <w:r>
+        <w:t>Architecture - 8-Stage Pipeline</w:t>
+      </w:r>
+    </w:p>
+    <w:p>
+      <w:pPr>
+        <w:pStyle w:val="SourceCode"/>
+      </w:pPr>
+      <w:r>
+        <w:t>Question</w:t>
+      </w:r>
+    </w:p>
+    <w:p>
+      <w:pPr>
+        <w:pStyle w:val="SourceCode"/>
+      </w:pPr>
+      <w:r>
+        <w:t xml:space="preserve">   │</w:t>
+      </w:r>
+    </w:p>
+    <w:p>
+      <w:pPr>
+        <w:pStyle w:val="SourceCode"/>
+      </w:pPr>
+      <w:r>
+        <w:t xml:space="preserve">   ▼</w:t>
+      </w:r>
+    </w:p>
+    <w:p>
+      <w:pPr>
+        <w:pStyle w:val="SourceCode"/>
+      </w:pPr>
+      <w:r>
+        <w:t>1. Input validation     - injection blocking + network-domain gate</w:t>
+      </w:r>
+    </w:p>
+    <w:p>
+      <w:pPr>
+        <w:pStyle w:val="SourceCode"/>
+      </w:pPr>
+      <w:r>
+        <w:t xml:space="preserve">   │</w:t>
+      </w:r>
+    </w:p>
+    <w:p>
+      <w:pPr>
+        <w:pStyle w:val="SourceCode"/>
+      </w:pPr>
+      <w:r>
+        <w:t xml:space="preserve">   ▼</w:t>
+      </w:r>
+    </w:p>
+    <w:p>
+      <w:pPr>
+        <w:pStyle w:val="SourceCode"/>
+      </w:pPr>
+      <w:r>
+        <w:t>2. Query embedding      - all-MiniLM-L6-v2</w:t>
+      </w:r>
+    </w:p>
+    <w:p>
+      <w:pPr>
+        <w:pStyle w:val="SourceCode"/>
+      </w:pPr>
+      <w:r>
+        <w:t xml:space="preserve">   │</w:t>
+      </w:r>
+    </w:p>
+    <w:p>
+      <w:pPr>
+        <w:pStyle w:val="SourceCode"/>
+      </w:pPr>
+      <w:r>
+        <w:t xml:space="preserve">   ▼</w:t>
+      </w:r>
+    </w:p>
+    <w:p>
+      <w:pPr>
+        <w:pStyle w:val="SourceCode"/>
+      </w:pPr>
+      <w:r>
+        <w:t>3. ChromaDB retrieval   - top 15 candidates</w:t>
+      </w:r>
+    </w:p>
+    <w:p>
+      <w:pPr>
+        <w:pStyle w:val="SourceCode"/>
+      </w:pPr>
+      <w:r>
+        <w:t xml:space="preserve">   │</w:t>
+      </w:r>
+    </w:p>
+    <w:p>
+      <w:pPr>
+        <w:pStyle w:val="SourceCode"/>
+      </w:pPr>
+      <w:r>
+        <w:t xml:space="preserve">   ▼</w:t>
+      </w:r>
+    </w:p>
+    <w:p>
+      <w:pPr>
+        <w:pStyle w:val="SourceCode"/>
+      </w:pPr>
+      <w:r>
+        <w:t>4. Re-ranking           - ms-marco cross-encoder, keep top 5</w:t>
+      </w:r>
+    </w:p>
+    <w:p>
+      <w:pPr>
+        <w:pStyle w:val="SourceCode"/>
+      </w:pPr>
+      <w:r>
+        <w:t xml:space="preserve">   │</w:t>
+      </w:r>
+    </w:p>
+    <w:p>
+      <w:pPr>
+        <w:pStyle w:val="SourceCode"/>
+      </w:pPr>
+      <w:r>
+        <w:t xml:space="preserve">   ▼</w:t>
+      </w:r>
+    </w:p>
+    <w:p>
+      <w:pPr>
+        <w:pStyle w:val="SourceCode"/>
+      </w:pPr>
+      <w:r>
+        <w:t>5. Context assembly     - top chunks from docs/</w:t>
+      </w:r>
+    </w:p>
+    <w:p>
+      <w:pPr>
+        <w:pStyle w:val="SourceCode"/>
+      </w:pPr>
+      <w:r>
+        <w:t xml:space="preserve">   │</w:t>
+      </w:r>
+    </w:p>
+    <w:p>
+      <w:pPr>
+        <w:pStyle w:val="SourceCode"/>
+      </w:pPr>
+      <w:r>
+        <w:t xml:space="preserve">   ▼</w:t>
+      </w:r>
+    </w:p>
+    <w:p>
+      <w:pPr>
+        <w:pStyle w:val="SourceCode"/>
+      </w:pPr>
+      <w:r>
+        <w:t>6. Ollama generation    - qwen2.5:3b (only if retrieval gate passed)</w:t>
+      </w:r>
+    </w:p>
+    <w:p>
+      <w:pPr>
+        <w:pStyle w:val="SourceCode"/>
+      </w:pPr>
+      <w:r>
+        <w:t xml:space="preserve">   │</w:t>
+      </w:r>
+    </w:p>
+    <w:p>
+      <w:pPr>
+        <w:pStyle w:val="SourceCode"/>
+      </w:pPr>
+      <w:r>
+        <w:t xml:space="preserve">   ▼</w:t>
+      </w:r>
+    </w:p>
+    <w:p>
+      <w:pPr>
+        <w:pStyle w:val="SourceCode"/>
+      </w:pPr>
+      <w:r>
+        <w:t>7. Grounding check      - verify answer units against docs</w:t>
+      </w:r>
+    </w:p>
+    <w:p>
+      <w:pPr>
+        <w:pStyle w:val="SourceCode"/>
+      </w:pPr>
+      <w:r>
+        <w:t xml:space="preserve">   │</w:t>
+      </w:r>
+    </w:p>
+    <w:p>
+      <w:pPr>
+        <w:pStyle w:val="SourceCode"/>
+      </w:pPr>
+      <w:r>
+        <w:t xml:space="preserve">   ▼</w:t>
+      </w:r>
+    </w:p>
+    <w:p>
+      <w:pPr>
+        <w:pStyle w:val="SourceCode"/>
+      </w:pPr>
+      <w:r>
+        <w:t>8. Confidence scoring   - 0-100 with HIGH / MEDIUM / LOW</w:t>
+      </w:r>
+    </w:p>
+    <w:p>
+      <w:pPr>
+        <w:pStyle w:val="SourceCode"/>
+      </w:pPr>
+      <w:r>
+        <w:t xml:space="preserve">   │</w:t>
+      </w:r>
+    </w:p>
+    <w:p>
+      <w:pPr>
+        <w:pStyle w:val="SourceCode"/>
+      </w:pPr>
+      <w:r>
+        <w:t xml:space="preserve">   ▼</w:t>
+      </w:r>
+    </w:p>
+    <w:p>
+      <w:pPr>
+        <w:pStyle w:val="SourceCode"/>
+      </w:pPr>
+      <w:r>
+        <w:t>Answer + sources</w:t>
+      </w:r>
+    </w:p>
+    <w:p>
+      <w:pPr>
+        <w:pStyle w:val="Heading2"/>
+      </w:pPr>
+      <w:r>
+        <w:t>Guard Rails</w:t>
       </w:r>
     </w:p>
     <w:p>
       <w:pPr>
         <w:pStyle w:val="Compact"/>
-        <w:numPr>
-          <w:ilvl w:val="0"/>
-          <w:numId w:val="3"/>
-        </w:numPr>
-      </w:pPr>
-      <w:r>
-        <w:t>Helpdesk knowledge retrieval</w:t>
+      </w:pPr>
+      <w:r>
+        <w:t>Prompt-injection blocking - patterns such as "ignore previous instructions" are blocked at input validation.</w:t>
       </w:r>
     </w:p>
     <w:p>
       <w:pPr>
         <w:pStyle w:val="Compact"/>
-        <w:numPr>
-          <w:ilvl w:val="0"/>
-          <w:numId w:val="3"/>
-        </w:numPr>
-      </w:pPr>
-      <w:r>
-        <w:t>Internal IT documentation search</w:t>
+      </w:pPr>
+      <w:r>
+        <w:t>Network-domain gate - the KB only covers network support; questions with no network terms are refused before retrieval (e.g. "my computer is slow").</w:t>
       </w:r>
     </w:p>
     <w:p>
       <w:pPr>
         <w:pStyle w:val="Compact"/>
-        <w:ind w:left="360"/>
-      </w:pPr>
+      </w:pPr>
+      <w:r>
+        <w:t>Retrieval gate - if the best matching chunk scores below 0.40 similarity, the LLM is never called; the system refuses with "I don't have information about this in the knowledge base."</w:t>
+      </w:r>
+    </w:p>
+    <w:p>
+      <w:pPr>
+        <w:pStyle w:val="Compact"/>
+      </w:pPr>
+      <w:r>
+        <w:t>Grounding check - every answer unit is verified against the retrieved docs (lexical check for short units, embedding similarity &gt;= 0.42 for prose). Ungrounded tails are trimmed; fully ungrounded answers are rejected.</w:t>
+      </w:r>
+    </w:p>
+    <w:p>
+      <w:pPr>
+        <w:pStyle w:val="Compact"/>
+      </w:pPr>
+      <w:r>
+        <w:t>Cautious-refusal retry - if the model refuses despite relevant docs, it retries once with a nudge prompt.</w:t>
+      </w:r>
     </w:p>
     <w:p>
       <w:pPr>
         <w:pStyle w:val="Heading2"/>
       </w:pPr>
-      <w:bookmarkStart w:id="4" w:name="technology-stack"/>
-      <w:bookmarkEnd w:id="3"/>
-      <w:r>
-        <w:t>Technology Stack</w:t>
-      </w:r>
-    </w:p>
-    <w:p>
-      <w:pPr>
-        <w:pStyle w:val="Compact"/>
-        <w:numPr>
-          <w:ilvl w:val="0"/>
-          <w:numId w:val="4"/>
-        </w:numPr>
-      </w:pPr>
-      <w:r>
-        <w:t>Python</w:t>
-      </w:r>
-    </w:p>
-    <w:p>
-      <w:pPr>
-        <w:pStyle w:val="Compact"/>
-        <w:numPr>
-          <w:ilvl w:val="0"/>
-          <w:numId w:val="4"/>
-        </w:numPr>
-      </w:pPr>
-      <w:r>
-        <w:t>Streamlit</w:t>
-      </w:r>
-    </w:p>
-    <w:p>
-      <w:pPr>
-        <w:pStyle w:val="Compact"/>
-        <w:numPr>
-          <w:ilvl w:val="0"/>
-          <w:numId w:val="4"/>
-        </w:numPr>
-      </w:pPr>
-      <w:r>
-        <w:t>LangChain</w:t>
-      </w:r>
-    </w:p>
-    <w:p>
-      <w:pPr>
-        <w:pStyle w:val="Compact"/>
-        <w:numPr>
-          <w:ilvl w:val="0"/>
-          <w:numId w:val="4"/>
-        </w:numPr>
-      </w:pPr>
-      <w:r>
-        <w:t>ChromaDB</w:t>
-      </w:r>
-    </w:p>
-    <w:p>
-      <w:pPr>
-        <w:pStyle w:val="Compact"/>
-        <w:numPr>
-          <w:ilvl w:val="0"/>
-          <w:numId w:val="4"/>
-        </w:numPr>
-      </w:pPr>
-      <w:r>
-        <w:t>Ollama</w:t>
-      </w:r>
-    </w:p>
-    <w:p>
-      <w:pPr>
-        <w:pStyle w:val="Compact"/>
-        <w:numPr>
-          <w:ilvl w:val="0"/>
-          <w:numId w:val="4"/>
-        </w:numPr>
-      </w:pPr>
-      <w:r>
-        <w:t>Llama 3.2</w:t>
-      </w:r>
-    </w:p>
-    <w:p>
-      <w:pPr>
-        <w:pStyle w:val="Compact"/>
-        <w:numPr>
-          <w:ilvl w:val="0"/>
-          <w:numId w:val="4"/>
-        </w:numPr>
-      </w:pPr>
-      <w:r>
-        <w:t>Sentence Transformers</w:t>
-      </w:r>
-    </w:p>
-    <w:p>
-      <w:pPr>
-        <w:pStyle w:val="Heading2"/>
-      </w:pPr>
-      <w:bookmarkStart w:id="5" w:name="project-structure"/>
-      <w:bookmarkEnd w:id="4"/>
-      <w:r>
-        <w:lastRenderedPageBreak/>
-        <w:t>Project Structure</w:t>
-      </w:r>
-    </w:p>
-    <w:p>
-      <w:pPr>
-        <w:pStyle w:val="SourceCode"/>
-        <w:rPr>
-          <w:rStyle w:val="VerbatimChar"/>
-        </w:rPr>
-      </w:pPr>
-      <w:r>
-        <w:rPr>
-          <w:rStyle w:val="VerbatimChar"/>
-        </w:rPr>
-        <w:t>IT-Support-Knowledge-Assistant/</w:t>
-      </w:r>
-      <w:r>
-        <w:br/>
-      </w:r>
-      <w:r>
-        <w:rPr>
-          <w:rStyle w:val="VerbatimChar"/>
-        </w:rPr>
-        <w:t>│</w:t>
-      </w:r>
-      <w:r>
-        <w:br/>
-      </w:r>
-      <w:r>
-        <w:rPr>
-          <w:rStyle w:val="VerbatimChar"/>
-        </w:rPr>
-        <w:t>├── app.py</w:t>
-      </w:r>
-      <w:r>
-        <w:br/>
-      </w:r>
-      <w:r>
-        <w:rPr>
-          <w:rStyle w:val="VerbatimChar"/>
-        </w:rPr>
-        <w:t>├── ingest.py</w:t>
-      </w:r>
-      <w:r>
-        <w:br/>
-      </w:r>
-      <w:r>
-        <w:rPr>
-          <w:rStyle w:val="VerbatimChar"/>
-        </w:rPr>
-        <w:t>├── rag_engine.py</w:t>
-      </w:r>
-      <w:r>
-        <w:br/>
-      </w:r>
-      <w:r>
-        <w:rPr>
-          <w:rStyle w:val="VerbatimChar"/>
-        </w:rPr>
-        <w:t>├── requirements.txt</w:t>
-      </w:r>
-      <w:r>
-        <w:br/>
-      </w:r>
-      <w:r>
-        <w:rPr>
-          <w:rStyle w:val="VerbatimChar"/>
-        </w:rPr>
-        <w:t>├── README.md</w:t>
-      </w:r>
-      <w:r>
-        <w:br/>
-      </w:r>
-      <w:r>
-        <w:rPr>
-          <w:rStyle w:val="VerbatimChar"/>
-        </w:rPr>
-        <w:t>├── .gitignore</w:t>
-      </w:r>
-      <w:r>
-        <w:br/>
-      </w:r>
-      <w:r>
-        <w:rPr>
-          <w:rStyle w:val="VerbatimChar"/>
-        </w:rPr>
-        <w:t>│</w:t>
-      </w:r>
-      <w:r>
-        <w:br/>
-      </w:r>
-      <w:r>
-        <w:rPr>
-          <w:rStyle w:val="VerbatimChar"/>
-        </w:rPr>
-        <w:t>├── data/</w:t>
-      </w:r>
-      <w:r>
-        <w:br/>
-      </w:r>
-      <w:r>
-        <w:rPr>
-          <w:rStyle w:val="VerbatimChar"/>
-        </w:rPr>
-        <w:t>│   ├── troubleshooting-guides/</w:t>
-      </w:r>
-      <w:r>
-        <w:br/>
-      </w:r>
-      <w:r>
-        <w:rPr>
-          <w:rStyle w:val="VerbatimChar"/>
-        </w:rPr>
-        <w:t>│   ├── networking/</w:t>
-      </w:r>
-      <w:r>
-        <w:br/>
-      </w:r>
-      <w:r>
-        <w:rPr>
-          <w:rStyle w:val="VerbatimChar"/>
-        </w:rPr>
-        <w:t>│   └── documentation/</w:t>
-      </w:r>
-      <w:r>
-        <w:br/>
-      </w:r>
-      <w:r>
-        <w:rPr>
-          <w:rStyle w:val="VerbatimChar"/>
-        </w:rPr>
-        <w:t>│</w:t>
-      </w:r>
-      <w:r>
-        <w:br/>
-      </w:r>
-      <w:r>
-        <w:rPr>
-          <w:rStyle w:val="VerbatimChar"/>
-        </w:rPr>
-        <w:t>├── chroma_db/</w:t>
-      </w:r>
-      <w:r>
-        <w:br/>
-      </w:r>
-      <w:r>
-        <w:rPr>
-          <w:rStyle w:val="VerbatimChar"/>
-        </w:rPr>
-        <w:t>│</w:t>
-      </w:r>
-      <w:r>
-        <w:br/>
-      </w:r>
-      <w:r>
-        <w:rPr>
-          <w:rStyle w:val="VerbatimChar"/>
-        </w:rPr>
-        <w:t>└── a</w:t>
-      </w:r>
-      <w:r>
-        <w:rPr>
-          <w:rStyle w:val="VerbatimChar"/>
-        </w:rPr>
-        <w:t>ssets/</w:t>
-      </w:r>
-    </w:p>
-    <w:p>
-      <w:pPr>
-        <w:pStyle w:val="SourceCode"/>
-      </w:pPr>
-    </w:p>
-    <w:p>
-      <w:pPr>
-        <w:pStyle w:val="Heading2"/>
-      </w:pPr>
-      <w:bookmarkStart w:id="6" w:name="installation"/>
-      <w:bookmarkEnd w:id="5"/>
-      <w:r>
-        <w:t>Installation</w:t>
-      </w:r>
-    </w:p>
-    <w:p>
-      <w:pPr>
-        <w:pStyle w:val="Heading3"/>
-      </w:pPr>
-      <w:bookmarkStart w:id="7" w:name="create-virtual-environment"/>
-      <w:r>
-        <w:t>Create Virtual Environment</w:t>
-      </w:r>
-    </w:p>
-    <w:p>
-      <w:pPr>
-        <w:pStyle w:val="SourceCode"/>
-        <w:rPr>
-          <w:rStyle w:val="NormalTok"/>
-        </w:rPr>
-      </w:pPr>
-      <w:proofErr w:type="gramStart"/>
-      <w:r>
-        <w:rPr>
-          <w:rStyle w:val="ExtensionTok"/>
-        </w:rPr>
-        <w:t>python</w:t>
-      </w:r>
-      <w:proofErr w:type="gramEnd"/>
-      <w:r>
-        <w:rPr>
-          <w:rStyle w:val="NormalTok"/>
-        </w:rPr>
-        <w:t xml:space="preserve"> </w:t>
-      </w:r>
-      <w:r>
-        <w:rPr>
-          <w:rStyle w:val="AttributeTok"/>
-        </w:rPr>
-        <w:t>-m</w:t>
-      </w:r>
-      <w:r>
-        <w:rPr>
-          <w:rStyle w:val="NormalTok"/>
-        </w:rPr>
-        <w:t xml:space="preserve"> </w:t>
-      </w:r>
-      <w:proofErr w:type="spellStart"/>
-      <w:r>
-        <w:rPr>
-          <w:rStyle w:val="NormalTok"/>
-        </w:rPr>
-        <w:t>venv</w:t>
-      </w:r>
-      <w:proofErr w:type="spellEnd"/>
-      <w:r>
-        <w:rPr>
-          <w:rStyle w:val="NormalTok"/>
-        </w:rPr>
-        <w:t xml:space="preserve"> </w:t>
-      </w:r>
-      <w:proofErr w:type="spellStart"/>
-      <w:r>
-        <w:rPr>
-          <w:rStyle w:val="NormalTok"/>
-        </w:rPr>
-        <w:t>venv</w:t>
-      </w:r>
-      <w:proofErr w:type="spellEnd"/>
-    </w:p>
-    <w:p>
-      <w:pPr>
-        <w:pStyle w:val="SourceCode"/>
-      </w:pPr>
-    </w:p>
-    <w:p>
-      <w:pPr>
-        <w:pStyle w:val="Heading3"/>
-      </w:pPr>
-      <w:bookmarkStart w:id="8" w:name="activate-virtual-environment"/>
-      <w:bookmarkEnd w:id="7"/>
-      <w:r>
-        <w:t>Activate Virtual Environment</w:t>
+      <w:r>
+        <w:t>Author</w:t>
       </w:r>
     </w:p>
     <w:p>
@@ -640,486 +887,8 @@
         <w:pStyle w:val="FirstParagraph"/>
       </w:pPr>
       <w:r>
-        <w:t>Windows:</w:t>
-      </w:r>
-    </w:p>
-    <w:p>
-      <w:pPr>
-        <w:pStyle w:val="SourceCode"/>
-        <w:rPr>
-          <w:rStyle w:val="ExtensionTok"/>
-        </w:rPr>
-      </w:pPr>
-      <w:proofErr w:type="spellStart"/>
-      <w:r>
-        <w:rPr>
-          <w:rStyle w:val="ExtensionTok"/>
-        </w:rPr>
-        <w:t>venv</w:t>
-      </w:r>
-      <w:proofErr w:type="spellEnd"/>
-      <w:r>
-        <w:rPr>
-          <w:rStyle w:val="ExtensionTok"/>
-        </w:rPr>
-        <w:t>\Scripts\activate</w:t>
-      </w:r>
-    </w:p>
-    <w:p>
-      <w:pPr>
-        <w:pStyle w:val="SourceCode"/>
-      </w:pPr>
-    </w:p>
-    <w:p>
-      <w:pPr>
-        <w:pStyle w:val="Heading3"/>
-      </w:pPr>
-      <w:bookmarkStart w:id="9" w:name="install-dependencies"/>
-      <w:bookmarkEnd w:id="8"/>
-      <w:r>
-        <w:t>Install Dependencies</w:t>
-      </w:r>
-    </w:p>
-    <w:p>
-      <w:pPr>
-        <w:pStyle w:val="SourceCode"/>
-        <w:rPr>
-          <w:rStyle w:val="NormalTok"/>
-        </w:rPr>
-      </w:pPr>
-      <w:proofErr w:type="gramStart"/>
-      <w:r>
-        <w:rPr>
-          <w:rStyle w:val="ExtensionTok"/>
-        </w:rPr>
-        <w:t>pip</w:t>
-      </w:r>
-      <w:proofErr w:type="gramEnd"/>
-      <w:r>
-        <w:rPr>
-          <w:rStyle w:val="NormalTok"/>
-        </w:rPr>
-        <w:t xml:space="preserve"> install </w:t>
-      </w:r>
-      <w:r>
-        <w:rPr>
-          <w:rStyle w:val="AttributeTok"/>
-        </w:rPr>
-        <w:t>-r</w:t>
-      </w:r>
-      <w:r>
-        <w:rPr>
-          <w:rStyle w:val="NormalTok"/>
-        </w:rPr>
-        <w:t xml:space="preserve"> requirements.txt</w:t>
-      </w:r>
-    </w:p>
-    <w:p>
-      <w:pPr>
-        <w:pStyle w:val="SourceCode"/>
-      </w:pPr>
-    </w:p>
-    <w:p>
-      <w:pPr>
-        <w:pStyle w:val="Heading3"/>
-      </w:pPr>
-      <w:bookmarkStart w:id="10" w:name="install-ollama-model"/>
-      <w:bookmarkEnd w:id="9"/>
-      <w:r>
-        <w:t>Install Ollama Model</w:t>
-      </w:r>
-    </w:p>
-    <w:p>
-      <w:pPr>
-        <w:pStyle w:val="SourceCode"/>
-        <w:rPr>
-          <w:rStyle w:val="NormalTok"/>
-        </w:rPr>
-      </w:pPr>
-      <w:proofErr w:type="spellStart"/>
-      <w:proofErr w:type="gramStart"/>
-      <w:r>
-        <w:rPr>
-          <w:rStyle w:val="ExtensionTok"/>
-        </w:rPr>
-        <w:t>ollama</w:t>
-      </w:r>
-      <w:proofErr w:type="spellEnd"/>
-      <w:proofErr w:type="gramEnd"/>
-      <w:r>
-        <w:rPr>
-          <w:rStyle w:val="NormalTok"/>
-        </w:rPr>
-        <w:t xml:space="preserve"> pull llama3.2</w:t>
-      </w:r>
-    </w:p>
-    <w:p>
-      <w:pPr>
-        <w:pStyle w:val="SourceCode"/>
-      </w:pPr>
-    </w:p>
-    <w:p>
-      <w:pPr>
-        <w:pStyle w:val="Heading3"/>
-      </w:pPr>
-      <w:bookmarkStart w:id="11" w:name="add-documents"/>
-      <w:bookmarkEnd w:id="10"/>
-      <w:r>
-        <w:lastRenderedPageBreak/>
-        <w:t>Add Documents</w:t>
-      </w:r>
-    </w:p>
-    <w:p>
-      <w:pPr>
-        <w:pStyle w:val="FirstParagraph"/>
-      </w:pPr>
-      <w:r>
-        <w:t xml:space="preserve">Place your documentation, troubleshooting guides, and knowledge base files into the </w:t>
-      </w:r>
-      <w:r>
-        <w:rPr>
-          <w:rStyle w:val="VerbatimChar"/>
-        </w:rPr>
-        <w:t>data</w:t>
-      </w:r>
-      <w:r>
-        <w:t xml:space="preserve"> folder.</w:t>
-      </w:r>
-    </w:p>
-    <w:p>
-      <w:pPr>
-        <w:pStyle w:val="BodyText"/>
-      </w:pPr>
-    </w:p>
-    <w:p>
-      <w:pPr>
-        <w:pStyle w:val="Heading3"/>
-      </w:pPr>
-      <w:bookmarkStart w:id="12" w:name="build-vector-database"/>
-      <w:bookmarkEnd w:id="11"/>
-      <w:r>
-        <w:t>Build Vector Database</w:t>
-      </w:r>
-    </w:p>
-    <w:p>
-      <w:pPr>
-        <w:pStyle w:val="SourceCode"/>
-        <w:rPr>
-          <w:rStyle w:val="NormalTok"/>
-        </w:rPr>
-      </w:pPr>
-      <w:proofErr w:type="gramStart"/>
-      <w:r>
-        <w:rPr>
-          <w:rStyle w:val="ExtensionTok"/>
-        </w:rPr>
-        <w:t>python</w:t>
-      </w:r>
-      <w:proofErr w:type="gramEnd"/>
-      <w:r>
-        <w:rPr>
-          <w:rStyle w:val="NormalTok"/>
-        </w:rPr>
-        <w:t xml:space="preserve"> ingest.py</w:t>
-      </w:r>
-    </w:p>
-    <w:p>
-      <w:pPr>
-        <w:pStyle w:val="SourceCode"/>
-      </w:pPr>
-    </w:p>
-    <w:p>
-      <w:pPr>
-        <w:pStyle w:val="Heading3"/>
-      </w:pPr>
-      <w:bookmarkStart w:id="13" w:name="launch-application"/>
-      <w:bookmarkEnd w:id="12"/>
-      <w:r>
-        <w:t>Launch Application</w:t>
-      </w:r>
-    </w:p>
-    <w:p>
-      <w:pPr>
-        <w:pStyle w:val="SourceCode"/>
-        <w:rPr>
-          <w:rStyle w:val="NormalTok"/>
-        </w:rPr>
-      </w:pPr>
-      <w:proofErr w:type="spellStart"/>
-      <w:proofErr w:type="gramStart"/>
-      <w:r>
-        <w:rPr>
-          <w:rStyle w:val="ExtensionTok"/>
-        </w:rPr>
-        <w:t>streamlit</w:t>
-      </w:r>
-      <w:proofErr w:type="spellEnd"/>
-      <w:proofErr w:type="gramEnd"/>
-      <w:r>
-        <w:rPr>
-          <w:rStyle w:val="NormalTok"/>
-        </w:rPr>
-        <w:t xml:space="preserve"> run app.py</w:t>
-      </w:r>
-    </w:p>
-    <w:p>
-      <w:pPr>
-        <w:pStyle w:val="SourceCode"/>
-      </w:pPr>
-    </w:p>
-    <w:p>
-      <w:pPr>
-        <w:pStyle w:val="Heading2"/>
-      </w:pPr>
-      <w:bookmarkStart w:id="14" w:name="architecture"/>
-      <w:bookmarkEnd w:id="6"/>
-      <w:bookmarkEnd w:id="13"/>
-      <w:r>
-        <w:t>Archit</w:t>
-      </w:r>
-      <w:r>
-        <w:t>ecture</w:t>
-      </w:r>
-    </w:p>
-    <w:p>
-      <w:pPr>
-        <w:pStyle w:val="SourceCode"/>
-        <w:rPr>
-          <w:rStyle w:val="VerbatimChar"/>
-        </w:rPr>
-      </w:pPr>
-      <w:r>
-        <w:rPr>
-          <w:rStyle w:val="VerbatimChar"/>
-        </w:rPr>
-        <w:t>Documents</w:t>
-      </w:r>
-      <w:r>
-        <w:br/>
-      </w:r>
-      <w:r>
-        <w:rPr>
-          <w:rStyle w:val="VerbatimChar"/>
-        </w:rPr>
-        <w:t xml:space="preserve">    │</w:t>
-      </w:r>
-      <w:r>
-        <w:br/>
-      </w:r>
-      <w:r>
-        <w:rPr>
-          <w:rStyle w:val="VerbatimChar"/>
-        </w:rPr>
-        <w:t xml:space="preserve">    ▼</w:t>
-      </w:r>
-      <w:r>
-        <w:br/>
-      </w:r>
-      <w:r>
-        <w:rPr>
-          <w:rStyle w:val="VerbatimChar"/>
-        </w:rPr>
-        <w:t>Document Loader</w:t>
-      </w:r>
-      <w:r>
-        <w:br/>
-      </w:r>
-      <w:r>
-        <w:rPr>
-          <w:rStyle w:val="VerbatimChar"/>
-        </w:rPr>
-        <w:t xml:space="preserve">    │</w:t>
-      </w:r>
-      <w:r>
-        <w:br/>
-      </w:r>
-      <w:r>
-        <w:rPr>
-          <w:rStyle w:val="VerbatimChar"/>
-        </w:rPr>
-        <w:t xml:space="preserve">    ▼</w:t>
-      </w:r>
-      <w:r>
-        <w:br/>
-      </w:r>
-      <w:r>
-        <w:rPr>
-          <w:rStyle w:val="VerbatimChar"/>
-        </w:rPr>
-        <w:t>Text Chunking</w:t>
-      </w:r>
-      <w:r>
-        <w:br/>
-      </w:r>
-      <w:r>
-        <w:rPr>
-          <w:rStyle w:val="VerbatimChar"/>
-        </w:rPr>
-        <w:t xml:space="preserve">    │</w:t>
-      </w:r>
-      <w:r>
-        <w:br/>
-      </w:r>
-      <w:r>
-        <w:rPr>
-          <w:rStyle w:val="VerbatimChar"/>
-        </w:rPr>
-        <w:t xml:space="preserve">    ▼</w:t>
-      </w:r>
-      <w:r>
-        <w:br/>
-      </w:r>
-      <w:r>
-        <w:rPr>
-          <w:rStyle w:val="VerbatimChar"/>
-        </w:rPr>
-        <w:t>Embeddings</w:t>
-      </w:r>
-      <w:r>
-        <w:br/>
-      </w:r>
-      <w:r>
-        <w:rPr>
-          <w:rStyle w:val="VerbatimChar"/>
-        </w:rPr>
-        <w:t xml:space="preserve">    │</w:t>
-      </w:r>
-      <w:r>
-        <w:br/>
-      </w:r>
-      <w:r>
-        <w:rPr>
-          <w:rStyle w:val="VerbatimChar"/>
-        </w:rPr>
-        <w:t xml:space="preserve">    ▼</w:t>
-      </w:r>
-      <w:r>
-        <w:br/>
-      </w:r>
-      <w:r>
-        <w:rPr>
-          <w:rStyle w:val="VerbatimChar"/>
-        </w:rPr>
-        <w:t>ChromaDB</w:t>
-      </w:r>
-      <w:r>
-        <w:br/>
-      </w:r>
-      <w:r>
-        <w:rPr>
-          <w:rStyle w:val="VerbatimChar"/>
-        </w:rPr>
-        <w:t xml:space="preserve">    │</w:t>
-      </w:r>
-      <w:r>
-        <w:br/>
-      </w:r>
-      <w:r>
-        <w:rPr>
-          <w:rStyle w:val="VerbatimChar"/>
-        </w:rPr>
-        <w:t xml:space="preserve">    ▼</w:t>
-      </w:r>
-      <w:r>
-        <w:br/>
-      </w:r>
-      <w:r>
-        <w:rPr>
-          <w:rStyle w:val="VerbatimChar"/>
-        </w:rPr>
-        <w:t>Context Retrieval</w:t>
-      </w:r>
-      <w:r>
-        <w:br/>
-      </w:r>
-      <w:r>
-        <w:rPr>
-          <w:rStyle w:val="VerbatimChar"/>
-        </w:rPr>
-        <w:t xml:space="preserve">    │</w:t>
-      </w:r>
-      <w:r>
-        <w:br/>
-      </w:r>
-      <w:r>
-        <w:rPr>
-          <w:rStyle w:val="VerbatimChar"/>
-        </w:rPr>
-        <w:t xml:space="preserve">    ▼</w:t>
-      </w:r>
-      <w:r>
-        <w:br/>
-      </w:r>
-      <w:r>
-        <w:rPr>
-          <w:rStyle w:val="VerbatimChar"/>
-        </w:rPr>
-        <w:t>Llama 3.2 (Ollama)</w:t>
-      </w:r>
-      <w:r>
-        <w:br/>
-      </w:r>
-      <w:r>
-        <w:rPr>
-          <w:rStyle w:val="VerbatimChar"/>
-        </w:rPr>
-        <w:t xml:space="preserve">    │</w:t>
-      </w:r>
-      <w:r>
-        <w:br/>
-      </w:r>
-      <w:r>
-        <w:rPr>
-          <w:rStyle w:val="VerbatimChar"/>
-        </w:rPr>
-        <w:t xml:space="preserve">    ▼</w:t>
-      </w:r>
-      <w:r>
-        <w:br/>
-      </w:r>
-      <w:r>
-        <w:rPr>
-          <w:rStyle w:val="VerbatimChar"/>
-        </w:rPr>
-        <w:t>Generated Answer</w:t>
-      </w:r>
-    </w:p>
-    <w:p>
-      <w:pPr>
-        <w:pStyle w:val="SourceCode"/>
-      </w:pPr>
-    </w:p>
-    <w:p>
-      <w:pPr>
-        <w:pStyle w:val="BodyText"/>
-      </w:pPr>
-      <w:bookmarkStart w:id="15" w:name="disclaimer"/>
-      <w:bookmarkEnd w:id="14"/>
-    </w:p>
-    <w:p>
-      <w:pPr>
-        <w:pStyle w:val="Heading2"/>
-        <w:jc w:val="center"/>
-      </w:pPr>
-      <w:bookmarkStart w:id="16" w:name="author"/>
-      <w:bookmarkEnd w:id="15"/>
-      <w:r>
-        <w:t xml:space="preserve">                                                                                           </w:t>
-      </w:r>
-      <w:r>
-        <w:t>Author</w:t>
-      </w:r>
-    </w:p>
-    <w:p>
-      <w:pPr>
-        <w:pStyle w:val="FirstParagraph"/>
-        <w:jc w:val="right"/>
-      </w:pPr>
-      <w:r>
         <w:t>Balaram R</w:t>
       </w:r>
-      <w:bookmarkEnd w:id="0"/>
-      <w:bookmarkEnd w:id="16"/>
     </w:p>
     <w:sectPr>
       <w:footnotePr>

</xml_diff>